<commit_message>
Workshop deck: 4 slides with animations, shorter USP
Co-Authored-By: Claude Sonnet 5.5 <noreply@anthropic.com>
Claude-Session: https://claude.ai/code/session_01MmjQUuUoAAFt56mVbb2Lw5
</commit_message>
<xml_diff>
--- a/docs/Workshop_Almau_Messenger.docx
+++ b/docs/Workshop_Almau_Messenger.docx
@@ -220,7 +220,7 @@
         <w:t xml:space="preserve">УТП: </w:t>
       </w:r>
       <w:r>
-        <w:t>Для студентов AlmaU, которым не с кем идти на мероприятия клубов, Almau Messenger помогает найти компанию с общими интересами и записаться в пару нажатий — анонимно, прямо в Telegram, без скачивания приложения.</w:t>
+        <w:t>Для студентов AlmaU без компании: найдём её на мероприятие анонимно, прямо в Telegram. (Кому — студентам AlmaU без компании; польза — компания на мероприятие; за счёт чего — анонимно, в Telegram, привязано к реальным мероприятиям.)</w:t>
       </w:r>
     </w:p>
     <w:p/>
@@ -811,7 +811,7 @@
         <w:pStyle w:val="Title"/>
       </w:pPr>
       <w:r>
-        <w:t>Текст для спитча (около 2 минут)</w:t>
+        <w:t>Текст для спитча (около 1,5–2 минут, 4 слайда)</w:t>
       </w:r>
     </w:p>
     <w:p>
@@ -827,7 +827,18 @@
         <w:t xml:space="preserve">Дияр: </w:t>
       </w:r>
       <w:r>
-        <w:t>Здравствуйте! Мы команда Almau Messenger. Наш продукт — Telegram-бот, который помогает студентам AlmaU найти компанию. Наш тизер — для одного конкретного человека: студента, который хочет пойти в горный поход клуба Summit Seekers, но ему не с кем идти. Заголовок такой: «В горы хочешь, а идти не с кем?»</w:t>
+        <w:t>Здравствуйте! Мы команда Almau Messenger: Telegram-бот, который помогает студентам AlmaU найти компанию. Наш тизер адресован одному человеку: студенту, который хочет пойти в горный поход клуба Summit Seekers, но ему не с кем идти.</w:t>
+      </w:r>
+    </w:p>
+    <w:p>
+      <w:r>
+        <w:rPr>
+          <w:b/>
+        </w:rPr>
+        <w:t xml:space="preserve">Абулхаир: </w:t>
+      </w:r>
+      <w:r>
+        <w:t>Наше УТП в одной фразе: для студентов AlmaU без компании мы найдём её на мероприятие анонимно, прямо в Telegram. Кому: студентам AlmaU. Польза: компания на мероприятие. За счёт чего: анонимность и Telegram, без скачивания. От обычных анонимных чатов нас отличает связь с реальными мероприятиями: знакомство заканчивается встречей.</w:t>
       </w:r>
     </w:p>
     <w:p>
@@ -838,18 +849,7 @@
         <w:t xml:space="preserve">Хамид: </w:t>
       </w:r>
       <w:r>
-        <w:t>Проблема простая: одному идти неловко, а знакомиться первым страшно. Поэтому в тизере мы показываем пользу одной фразой: найдём компанию из студентов AlmaU с такими же интересами, анонимно, прямо в Telegram. Призыв один: «Записаться в боте». Никаких длинных объяснений. На картинке логотип клуба и QR-код, который сразу открывает бота.</w:t>
-      </w:r>
-    </w:p>
-    <w:p>
-      <w:r>
-        <w:rPr>
-          <w:b/>
-        </w:rPr>
-        <w:t xml:space="preserve">Абулхаир: </w:t>
-      </w:r>
-      <w:r>
-        <w:t>Наше УТП: для студентов AlmaU, которым не с кем идти на мероприятия клубов, мы помогаем найти компанию и записаться в пару нажатий, анонимно и без скачивания приложений. Чем мы отличаемся от обычных анонимных чатов: мы привязаны к реальным мероприятиям. Знакомство заканчивается не перепиской, а встречей на походе. А клубу бот даёт запись, напоминания и безопасность.</w:t>
+        <w:t>Тизер: заголовок «В горы хочешь, а идти не с кем?», одна фраза пользы и один призыв — «Записаться в боте». На картинке логотип клуба и QR-код. Площадка — Instagram и рассылки Summit Seekers: оттуда к нам уже пришли 10–15 человек. Результат измеряем по ссылке с меткой.</w:t>
       </w:r>
     </w:p>
     <w:p>
@@ -860,29 +860,7 @@
         <w:t xml:space="preserve">Дияр: </w:t>
       </w:r>
       <w:r>
-        <w:t>Площадку мы выбрали там, где наш сегмент уже есть: Instagram и рассылки клуба Summit Seekers. Именно через рассылки к нам уже пришли первые 10–15 человек. Действие у тизера измеримое: ссылка с меткой показывает в отчёте клуба, сколько людей пришло из Instagram.</w:t>
-      </w:r>
-    </w:p>
-    <w:p>
-      <w:r>
-        <w:rPr>
-          <w:b/>
-        </w:rPr>
-        <w:t xml:space="preserve">Хамид: </w:t>
-      </w:r>
-      <w:r>
-        <w:t>Мы проверили тизер на [2–3] студентах. [Что они поняли и что осталось непонятным.] По их ответам мы изменили [одну часть: заголовок, УТП, визуал или призыв].</w:t>
-      </w:r>
-    </w:p>
-    <w:p>
-      <w:r>
-        <w:rPr>
-          <w:b/>
-        </w:rPr>
-        <w:t xml:space="preserve">Абулхаир: </w:t>
-      </w:r>
-      <w:r>
-        <w:t>Итог: у нас есть конкретный адресат, понятная польза, УТП, которое отличает нас от альтернатив, и первый платящий клиент — клуб Summit Seekers. Спасибо! Готовы к вопросам.</w:t>
+        <w:t>Мы проверили тизер на [2–3] студентах: [что они поняли и что осталось непонятным]. По их ответам изменили [одну часть]. Итог: у нас есть адресат, УТП в одну фразу, тизер с одним призывом и первый платящий клиент — Summit Seekers. Спасибо!</w:t>
       </w:r>
     </w:p>
     <w:p>

</xml_diff>

<commit_message>
Workshop: new creative USP and teaser (two anonymous chat bubbles)
Co-Authored-By: Claude Sonnet 5.5 <noreply@anthropic.com>
Claude-Session: https://claude.ai/code/session_01MmjQUuUoAAFt56mVbb2Lw5
</commit_message>
<xml_diff>
--- a/docs/Workshop_Almau_Messenger.docx
+++ b/docs/Workshop_Almau_Messenger.docx
@@ -220,7 +220,7 @@
         <w:t xml:space="preserve">УТП: </w:t>
       </w:r>
       <w:r>
-        <w:t>Для студентов AlmaU без компании: найдём её на мероприятие анонимно, прямо в Telegram. (Кому — студентам AlmaU без компании; польза — компания на мероприятие; за счёт чего — анонимно, в Telegram, привязано к реальным мероприятиям.)</w:t>
+        <w:t>Превращаем «не с кем идти» в «идём вместе»: анонимно находим студенту AlmaU попутчика на мероприятие, прямо в Telegram. (Кому — студентам AlmaU, которым неловко идти одним; польза — попутчик на мероприятие; за счёт чего — анонимно, в Telegram, имя и номер скрыты.)</w:t>
       </w:r>
     </w:p>
     <w:p/>
@@ -393,7 +393,7 @@
           </w:tcPr>
           <w:p>
             <w:r>
-              <w:t>В горы хочешь, а идти не с кем?</w:t>
+              <w:t>Тебе не с кем идти? Кому-то тоже.</w:t>
             </w:r>
           </w:p>
         </w:tc>
@@ -415,7 +415,7 @@
           </w:tcPr>
           <w:p>
             <w:r>
-              <w:t>Найдём компанию из студентов AlmaU с такими же интересами. Анонимно, прямо в Telegram, пока сам не захочешь раскрыться.</w:t>
+              <w:t>Мини-диалог двух анонимов: «Кто идёт один? Одному неловко…» — «Я тоже! Идём вместе?». Ниже: «Нажми «Иду»: бот найдёт попутчика. Имя и номер скрыты, пока сами не захотите».</w:t>
             </w:r>
           </w:p>
         </w:tc>
@@ -437,7 +437,7 @@
           </w:tcPr>
           <w:p>
             <w:r>
-              <w:t>Картинка-тизер (файл Teaser_Almau_Messenger.png): логотип клуба, QR-код на бота</w:t>
+              <w:t>Картинка-тизер (файл Teaser_Almau_Messenger.png): диалог двух анонимов, логотип и QR-код на бота</w:t>
             </w:r>
           </w:p>
         </w:tc>
@@ -459,7 +459,7 @@
           </w:tcPr>
           <w:p>
             <w:r>
-              <w:t>Записаться в боте →</w:t>
+              <w:t>Найти попутчика в боте →</w:t>
             </w:r>
           </w:p>
         </w:tc>
@@ -468,7 +468,7 @@
     <w:p/>
     <w:p>
       <w:r>
-        <w:t>Другой вариант заголовка для проверки (А/Б): «Не хочешь идти в поход один? Найди компанию, не называя себя».</w:t>
+        <w:t>Другой вариант заголовка для проверки (А/Б): «Одному идти не хочется? Найди того, кто тоже один».</w:t>
       </w:r>
     </w:p>
     <w:p>
@@ -827,7 +827,7 @@
         <w:t xml:space="preserve">Дияр: </w:t>
       </w:r>
       <w:r>
-        <w:t>Здравствуйте! Мы команда Almau Messenger: Telegram-бот, который помогает студентам AlmaU найти компанию. Наш тизер адресован одному человеку: студенту, который хочет пойти в горный поход клуба Summit Seekers, но ему не с кем идти.</w:t>
+        <w:t>Здравствуйте! Мы команда Almau Messenger. Представьте: вы хотите на мероприятие клуба, но идти одному неловко. Так вот, наша мысль простая: тому, кто идёт один, обычно рядом есть ещё один такой же. Просто они не знают друг о друге.</w:t>
       </w:r>
     </w:p>
     <w:p>
@@ -838,7 +838,7 @@
         <w:t xml:space="preserve">Абулхаир: </w:t>
       </w:r>
       <w:r>
-        <w:t>Наше УТП в одной фразе: для студентов AlmaU без компании мы найдём её на мероприятие анонимно, прямо в Telegram. Кому: студентам AlmaU. Польза: компания на мероприятие. За счёт чего: анонимность и Telegram, без скачивания. От обычных анонимных чатов нас отличает связь с реальными мероприятиями: знакомство заканчивается встречей.</w:t>
+        <w:t>Наше УТП: мы превращаем «не с кем идти» в «идём вместе». Кому: студентам AlmaU, которым неловко идти одним. Польза: попутчик на мероприятие. За счёт чего: анонимно, прямо в Telegram, имя и номер скрыты, пока сами не захотите. От обычных анонимных чатов нас отличает связь с реальными мероприятиями: знакомство заканчивается встречей.</w:t>
       </w:r>
     </w:p>
     <w:p>
@@ -849,7 +849,7 @@
         <w:t xml:space="preserve">Хамид: </w:t>
       </w:r>
       <w:r>
-        <w:t>Тизер: заголовок «В горы хочешь, а идти не с кем?», одна фраза пользы и один призыв — «Записаться в боте». На картинке логотип клуба и QR-код. Площадка — Instagram и рассылки Summit Seekers: оттуда к нам уже пришли 10–15 человек. Результат измеряем по ссылке с меткой.</w:t>
+        <w:t>Тизер такой: «Тебе не с кем идти? Кому-то тоже.» Ниже мини-диалог двух анонимов: «Кто идёт один?» — «Я тоже! Идём вместе?». Один призыв: найти попутчика в боте. Показываем в Instagram и рассылках клуба Summit Seekers: оттуда к нам уже пришли 10–15 человек.</w:t>
       </w:r>
     </w:p>
     <w:p>
@@ -860,7 +860,7 @@
         <w:t xml:space="preserve">Дияр: </w:t>
       </w:r>
       <w:r>
-        <w:t>Мы проверили тизер на [2–3] студентах: [что они поняли и что осталось непонятным]. По их ответам изменили [одну часть]. Итог: у нас есть адресат, УТП в одну фразу, тизер с одним призывом и первый платящий клиент — Summit Seekers. Спасибо!</w:t>
+        <w:t>Мы проверили тизер на [2–3] студентах: [что они поняли и что осталось непонятным]. По их ответам изменили [одну часть]. Итог: у нас есть адресат, УТП, тизер с одним призывом и первый платящий клиент — Summit Seekers. Спасибо!</w:t>
       </w:r>
     </w:p>
     <w:p>

</xml_diff>

<commit_message>
Teaser on mountain background in brand colors; Summit Seekers event template
Co-Authored-By: Claude Sonnet 5.5 <noreply@anthropic.com>
Claude-Session: https://claude.ai/code/session_01MmjQUuUoAAFt56mVbb2Lw5
</commit_message>
<xml_diff>
--- a/docs/Workshop_Almau_Messenger.docx
+++ b/docs/Workshop_Almau_Messenger.docx
@@ -437,7 +437,7 @@
           </w:tcPr>
           <w:p>
             <w:r>
-              <w:t>Картинка-тизер (файл Teaser_Almau_Messenger.png): диалог двух анонимов, логотип и QR-код на бота</w:t>
+              <w:t>Картинка-тизер (файл Teaser_Almau_Messenger.png): горы в фирменных цветах, диалог двух анонимов, QR-код на бота. Это шаблон для всех ивентов Summit Seekers: меняются только название и дата</w:t>
             </w:r>
           </w:p>
         </w:tc>
@@ -849,7 +849,7 @@
         <w:t xml:space="preserve">Хамид: </w:t>
       </w:r>
       <w:r>
-        <w:t>Тизер такой: «Тебе не с кем идти? Кому-то тоже.» Ниже мини-диалог двух анонимов: «Кто идёт один?» — «Я тоже! Идём вместе?». Один призыв: найти попутчика в боте. Показываем в Instagram и рассылках клуба Summit Seekers: оттуда к нам уже пришли 10–15 человек.</w:t>
+        <w:t>Тизер такой: «Тебе не с кем идти? Кому-то тоже.» Ниже мини-диалог двух анонимов: «Кто идёт один?» — «Я тоже! Идём вместе?». Один призыв: найти попутчика в боте. Этот шаблон мы будем использовать для всех ивентов Summit Seekers: меняем только название и дату. Показываем в Instagram и рассылках клуба: оттуда к нам уже пришли 10–15 человек.</w:t>
       </w:r>
     </w:p>
     <w:p>

</xml_diff>